<commit_message>
Update MR-MANAGE: close MR-MANAGE-ISS-003
Master PRD v2.2 Section 4 and NOTES-MANAGE v1.0 resolve the
cross-domain platform services gap. ISS-003 marked as resolved.
</commit_message>
<xml_diff>
--- a/PRDs/MR/MR-MANAGE.docx
+++ b/PRDs/MR/MR-MANAGE.docx
@@ -406,7 +406,7 @@
                 <w:sz w:val="24"/>
                 <w:szCs w:val="24"/>
               </w:rPr>
-              <w:t xml:space="preserve">04-02-26 22:30</w:t>
+              <w:t xml:space="preserve">04-05-26 22:00</w:t>
             </w:r>
           </w:p>
         </w:tc>
@@ -14830,7 +14830,7 @@
                 <w:sz w:val="24"/>
                 <w:szCs w:val="24"/>
               </w:rPr>
-              <w:t xml:space="preserve">The Master PRD does not define cross-domain platform services (Notes, Email, Calendaring, Discussion Threads) that span all domains. Administrator notes on mentor records are functionally required by MR-MANAGE, but the underlying entity structure should be defined as a shared platform capability, not within a single process document. The Master PRD needs a new section establishing these cross-domain services.</w:t>
+              <w:t xml:space="preserve">RESOLVED. The Master PRD v2.2 added Section 4 (Cross-Domain Services) defining Notes, Email, Calendar, and Survey services. The Notes Service process document (NOTES-MANAGE v1.0) provides the full service definition including the Note entity structure. Administrator notes on mentor records remain as dedicated fields per MR-MANAGE-REQ-009; the Notes Service handles general-purpose notes.</w:t>
             </w:r>
           </w:p>
         </w:tc>

</xml_diff>